<commit_message>
Replication package for Zenodo; final declarations
- scripts/09_replication_package.py builds the deposit zip with a
  replication README (steps, checks, file map, software versions,
  data terms), a pip lock file, .zenodo.json and CITATION.cff.
  Tested from a clean unzip: tests and gate pass, outputs identical.
- Manuscript declarations: AI-use statement approved; data statement
  points to the Zenodo deposit (DOI to be inserted after upload).
- Checklist, brief and handoff updated.

Co-Authored-By: Claude Opus 5.5 <noreply@anthropic.com>
Claude-Session: https://claude.ai/code/session_01S3jTpFNPUx5EsRRnssGU4g
</commit_message>
<xml_diff>
--- a/paper/manuscript.docx
+++ b/paper/manuscript.docx
@@ -3792,13 +3792,13 @@
         <w:t xml:space="preserve"> </w:t>
       </w:r>
       <w:r>
-        <w:t xml:space="preserve">(raw files, code and a one-command rebuild) is available at [repository URL to</w:t>
-      </w:r>
-      <w:r>
-        <w:t xml:space="preserve"> </w:t>
-      </w:r>
-      <w:r>
-        <w:t xml:space="preserve">be inserted].</w:t>
+        <w:t xml:space="preserve">(raw data files, code and a one-command rebuild of every number, table and</w:t>
+      </w:r>
+      <w:r>
+        <w:t xml:space="preserve"> </w:t>
+      </w:r>
+      <w:r>
+        <w:t xml:space="preserve">figure) is deposited at Zenodo, doi:[to be inserted on deposit].</w:t>
       </w:r>
     </w:p>
     <w:p>
@@ -3816,19 +3816,19 @@
         <w:t xml:space="preserve"> </w:t>
       </w:r>
       <w:r>
-        <w:t xml:space="preserve">[Author to confirm against the journal’s policy:] The code,</w:t>
-      </w:r>
-      <w:r>
-        <w:t xml:space="preserve"> </w:t>
-      </w:r>
-      <w:r>
-        <w:t xml:space="preserve">analysis and first draft were prepared with the assistance of Claude Code</w:t>
-      </w:r>
-      <w:r>
-        <w:t xml:space="preserve"> </w:t>
-      </w:r>
-      <w:r>
-        <w:t xml:space="preserve">(Anthropic). The author checked all results and is responsible for the content.</w:t>
+        <w:t xml:space="preserve">The code, analysis and first draft were prepared with the</w:t>
+      </w:r>
+      <w:r>
+        <w:t xml:space="preserve"> </w:t>
+      </w:r>
+      <w:r>
+        <w:t xml:space="preserve">assistance of Claude Code (Anthropic). The author checked all results and is</w:t>
+      </w:r>
+      <w:r>
+        <w:t xml:space="preserve"> </w:t>
+      </w:r>
+      <w:r>
+        <w:t xml:space="preserve">responsible for the content.</w:t>
       </w:r>
     </w:p>
     <w:bookmarkEnd w:id="34"/>

</xml_diff>